<commit_message>
docs: update architecture for hybrid LoRa transport
</commit_message>
<xml_diff>
--- a/AqOne_Technical_Profile_Aquanons-1.docx
+++ b/AqOne_Technical_Profile_Aquanons-1.docx
@@ -54,13 +54,7 @@
         <w:ind w:firstLine="432"/>
       </w:pPr>
       <w:r>
-        <w:rPr>
-          <w:rFonts w:ascii="Arial" w:hAnsi="Arial"/>
-          <w:b w:val="0"/>
-          <w:color w:val="161616"/>
-          <w:sz w:val="20"/>
-        </w:rPr>
-        <w:t>AqOne is a maritime safety platform designed for Philippine municipal fishers who routinely operate beyond dependable cellular coverage. Its foundation is a low-power LoRa mesh formed by boat-mounted nodes connected to the boats' existing batteries. Each node provides practical everyday value through short text messaging and weather alerts, while also carrying GPS, motion, pressure, health, and distress data between boats and toward a coastal gateway. Because every node relays for the others, the network grows stronger and more redundant as fleet participation increases.</w:t>
+        <w:t>AqOne is a maritime safety platform designed for Philippine municipal fishers who routinely operate beyond dependable cellular coverage. Its foundation is a hybrid low-power LoRa network: shared, removable boat safety pods provide the primary SOS origin and direct link to a tall shoreline gateway, while stationary navigational buoys provide fixed environmental observations and optional relay coverage. The pod's WiFi is only a short local handoff to the phone; LoRa carries the safety message toward shore.</w:t>
       </w:r>
     </w:p>
     <w:p>
@@ -69,13 +63,7 @@
         <w:ind w:firstLine="432"/>
       </w:pPr>
       <w:r>
-        <w:rPr>
-          <w:rFonts w:ascii="Arial" w:hAnsi="Arial"/>
-          <w:b w:val="0"/>
-          <w:color w:val="161616"/>
-          <w:sz w:val="20"/>
-        </w:rPr>
-        <w:t>The same hardware network enables three AI capabilities mapped to the full timeline of an emergency. Before an incident, barometric observations from moving boats are combined into a local pressure field for 30- to 90-minute squall nowcasting and targeted RETURN NOW alerts. During an incident, an on-device motion classifier detects capsize, collision, or possible man-overboard signatures, while backend logic combines trajectory anomalies, heartbeat loss, weather, and corroboration from neighboring nodes into a confidence-scored alert. After an incident, a physical drift ensemble corrected by local mesh observations generates a probability field showing where a person or disabled banca may have moved, then updates search priorities when responders report searched sectors or findings.</w:t>
+        <w:t>The hybrid network enables three AI capabilities mapped to the full timeline of an emergency. Before an incident, fixed-position barometric observations from stationary sensor buoys support 30- to 90-minute squall nowcasting and targeted RETURN NOW alerts. During an incident, the boat pod provides a physical SOS button and optional telemetry, while backend logic combines trajectory anomalies, contact history, weather, and corroboration from reachable field nodes into a confidence-scored alert. After an incident, a physical drift ensemble corrected by validated local observations generates a probability field showing where a person or disabled banca may have moved, then updates search priorities when responders report searched sectors or findings.</w:t>
       </w:r>
     </w:p>
     <w:p>
@@ -144,13 +132,7 @@
         <w:ind w:firstLine="432"/>
       </w:pPr>
       <w:r>
-        <w:rPr>
-          <w:rFonts w:ascii="Arial" w:hAnsi="Arial"/>
-          <w:b w:val="0"/>
-          <w:color w:val="161616"/>
-          <w:sz w:val="20"/>
-        </w:rPr>
-        <w:t>AqOne addresses this delay through a system whose communication, sensing, and intelligence layers reinforce one another. The permanent boat-mounted node is less likely to be forgotten or discharged than a handheld gadget. Routine messaging and weather information create a daily reason to keep it powered. The fleet itself supplies relay paths, pressure observations, GPS tracks, and neighboring evidence that a standalone beacon cannot provide.</w:t>
+        <w:t>AqOne addresses this delay through a system whose communication, sensing, and intelligence layers reinforce one another. A shared strap-on pod makes the SOS path available on participating boats without requiring every fisher to buy a personal beacon. Routine messaging and weather information create a daily reason to keep the pod ready. Stationary buoys supply fixed pressure observations, while the pods and optional relays supply radio, position, and delivery evidence.</w:t>
       </w:r>
     </w:p>
     <w:p>
@@ -239,13 +221,7 @@
         <w:spacing w:after="60" w:line="252" w:lineRule="auto"/>
       </w:pPr>
       <w:r>
-        <w:rPr>
-          <w:rFonts w:ascii="Arial" w:hAnsi="Arial"/>
-          <w:b w:val="0"/>
-          <w:color w:val="161616"/>
-          <w:sz w:val="19"/>
-        </w:rPr>
-        <w:t>User and vessel inputs. Vessel registration/profile, authorized contacts, trip state, manual SOS activation, short text messages, check-in responses, and responder-entered search observations.</w:t>
+        <w:t>User, vessel, and pod inputs. Vessel registration/profile, authorized contacts, trip state, manual SOS activation from the phone or pod button, short text messages, check-in responses, and responder-entered search observations.</w:t>
       </w:r>
     </w:p>
     <w:p>
@@ -254,13 +230,7 @@
         <w:spacing w:after="60" w:line="252" w:lineRule="auto"/>
       </w:pPr>
       <w:r>
-        <w:rPr>
-          <w:rFonts w:ascii="Arial" w:hAnsi="Arial"/>
-          <w:b w:val="0"/>
-          <w:color w:val="161616"/>
-          <w:sz w:val="19"/>
-        </w:rPr>
-        <w:t>Boat-node telemetry. GNSS position, speed, course, fix quality, timestamp, IMU motion windows and event scores, barometric pressure and trend, supply voltage, reset cause, radio quality, sensor faults, queue depth, firmware/model version, and heartbeat status.</w:t>
+        <w:t>Field-node telemetry. Boat pods may report GNSS position, speed, course, fix quality, timestamp, supply voltage, reset cause, radio quality, queue depth, firmware/model version, and heartbeat status. Stationary sensor buoys add fixed-position barometric pressure and optional motion/current observations.</w:t>
       </w:r>
     </w:p>
     <w:p>
@@ -269,13 +239,7 @@
         <w:spacing w:after="60" w:line="252" w:lineRule="auto"/>
       </w:pPr>
       <w:r>
-        <w:rPr>
-          <w:rFonts w:ascii="Arial" w:hAnsi="Arial"/>
-          <w:b w:val="0"/>
-          <w:color w:val="161616"/>
-          <w:sz w:val="19"/>
-        </w:rPr>
-        <w:t>Neighbor and mesh evidence. Relay path, hop count, link quality, message acknowledgements, neighboring-node observations, and corroboration of localized pressure or distress events.</w:t>
+        <w:t>Field-radio evidence. Direct or relayed path, hop count, link quality, message acknowledgements, serving pod or relay identity, and corroboration of localized pressure or distress events.</w:t>
       </w:r>
     </w:p>
     <w:p>
@@ -299,13 +263,7 @@
         <w:spacing w:after="60" w:line="252" w:lineRule="auto"/>
       </w:pPr>
       <w:r>
-        <w:rPr>
-          <w:rFonts w:ascii="Arial" w:hAnsi="Arial"/>
-          <w:b w:val="0"/>
-          <w:color w:val="161616"/>
-          <w:sz w:val="19"/>
-        </w:rPr>
-        <w:t>Hardware is required. Each boat carries a permanently mounted, boat-battery-powered node built around an ESP32-S3-class microcontroller, SX1262-class LoRa radio, GNSS receiver, six-axis IMU, barometer, guarded SOS button, marine antenna, protected power interface, nonvolatile storage, and weather-resistant enclosure. Coastal gateways combine LoRa reception, local storage, and authenticated internet backhaul.</w:t>
+        <w:t>Hardware is required, but the primary field device is shared and removable. The boat pod is built around an ESP32-S3-class microcontroller, SX1262-class LoRa radio, local WiFi access point, physical SOS button, suitable antenna, protected battery interface, nonvolatile storage, and weather-resistant strap-on enclosure; GNSS and additional sensors are added where justified. Stationary buoys carry the fixed barometer and other environmental sensors. The tall shoreline gateway combines LoRa reception, local storage, and authenticated internet backhaul.</w:t>
       </w:r>
     </w:p>
     <w:p>
@@ -344,13 +302,7 @@
         <w:spacing w:after="60" w:line="252" w:lineRule="auto"/>
       </w:pPr>
       <w:r>
-        <w:rPr>
-          <w:rFonts w:ascii="Arial" w:hAnsi="Arial"/>
-          <w:b w:val="0"/>
-          <w:color w:val="161616"/>
-          <w:sz w:val="19"/>
-        </w:rPr>
-        <w:t>Edge sensing and preprocessing. Firmware samples sensors at low power during normal operation and switches to higher-rate capture around suspected events. A circular buffer preserves evidence immediately before and after a trigger.</w:t>
+        <w:t>Edge sensing and preprocessing. Firmware samples available pod or stationary-node sensors at low power and writes critical events to nonvolatile storage before transmission. Optional higher-rate event capture is evaluated separately from the primary manual-SOS path.</w:t>
       </w:r>
     </w:p>
     <w:p>
@@ -359,13 +311,7 @@
         <w:spacing w:after="60" w:line="252" w:lineRule="auto"/>
       </w:pPr>
       <w:r>
-        <w:rPr>
-          <w:rFonts w:ascii="Arial" w:hAnsi="Arial"/>
-          <w:b w:val="0"/>
-          <w:color w:val="161616"/>
-          <w:sz w:val="19"/>
-        </w:rPr>
-        <w:t>On-device TinyML inference. A compact motion classifier labels capsize, sudden impact/collision, possible man-overboard, or normal-vessel motion. The node stores and transmits the alert before sending larger evidence, so classification does not delay notification.</w:t>
+        <w:t>Optional on-device event inference. A compact motion classifier may label capsize, sudden impact/collision, or possible man-overboard patterns when the pod hardware and training evidence justify it. It must never delay or gate a manual SOS, and unvalidated detections remain advisory.</w:t>
       </w:r>
     </w:p>
     <w:p>
@@ -374,13 +320,7 @@
         <w:spacing w:after="60" w:line="252" w:lineRule="auto"/>
       </w:pPr>
       <w:r>
-        <w:rPr>
-          <w:rFonts w:ascii="Arial" w:hAnsi="Arial"/>
-          <w:b w:val="0"/>
-          <w:color w:val="161616"/>
-          <w:sz w:val="19"/>
-        </w:rPr>
-        <w:t>Mesh store-and-forward. Nodes authenticate envelopes, suppress duplicates, respect hop/time limits, and relay traffic through priority queues. Manual and high-confidence automatic distress packets pre-empt routine telemetry and messages.</w:t>
+        <w:t>LoRa store-and-forward. Boat pods and optional relay buoys authenticate envelopes, suppress duplicates, respect hop/time limits, and use priority queues. Manual distress packets pre-empt routine telemetry and messages; direct pod-to-shore delivery is attempted before optional relay forwarding.</w:t>
       </w:r>
     </w:p>
     <w:p>
@@ -419,13 +359,7 @@
         <w:spacing w:after="60" w:line="252" w:lineRule="auto"/>
       </w:pPr>
       <w:r>
-        <w:rPr>
-          <w:rFonts w:ascii="Arial" w:hAnsi="Arial"/>
-          <w:b w:val="0"/>
-          <w:color w:val="161616"/>
-          <w:sz w:val="19"/>
-        </w:rPr>
-        <w:t>Squall nowcasting. Pressure, position, and time observations are quality-screened and represented as an irregular moving sensor graph or interpolated grid. A spatiotemporal model estimates localized squall-onset probability and lead time.</w:t>
+        <w:t>Squall nowcasting. Fixed-position pressure, position, and time observations from stationary sensor buoys are quality-screened and represented as a fixed sensor graph or interpolated grid. A spatiotemporal model estimates localized squall-onset probability and lead time.</w:t>
       </w:r>
     </w:p>
     <w:p>
@@ -434,13 +368,7 @@
         <w:spacing w:after="60" w:line="252" w:lineRule="auto"/>
       </w:pPr>
       <w:r>
-        <w:rPr>
-          <w:rFonts w:ascii="Arial" w:hAnsi="Arial"/>
-          <w:b w:val="0"/>
-          <w:color w:val="161616"/>
-          <w:sz w:val="19"/>
-        </w:rPr>
-        <w:t>Drift and Bayesian search support. An OpenDrift/Leeway-based ensemble propagates possible person/vessel locations under wind, current, and object-specific coefficients. A learned local-current residual corrects the coarse baseline where validated mesh observations support it. Search observations update the posterior probability and sector priorities.</w:t>
+        <w:t>Drift and Bayesian search support. An OpenDrift/Leeway-based ensemble propagates possible person/vessel locations under wind, current, and object-specific coefficients. A learned local-current residual corrects the coarse baseline only where validated stationary observations support it. Search observations update the posterior probability and sector priorities.</w:t>
       </w:r>
     </w:p>
     <w:p>
@@ -673,13 +601,7 @@
         <w:ind w:firstLine="432"/>
       </w:pPr>
       <w:r>
-        <w:rPr>
-          <w:rFonts w:ascii="Arial" w:hAnsi="Arial"/>
-          <w:b w:val="0"/>
-          <w:color w:val="161616"/>
-          <w:sz w:val="20"/>
-        </w:rPr>
-        <w:t>The diagram shows the principal trust and processing boundaries. The boat nodes retain sensing, local classification, durable event creation, and mesh relay. The shore gateway bridges the low-bandwidth safety network to the backend without changing the original source identity or event time. Backend services perform cross-node correlation and model execution, while the operations console remains the human decision point for acknowledgement, dispatch, search allocation, cancellation, and closure.</w:t>
+        <w:t>The diagram shows the principal trust and processing boundaries. Boat pods retain local phone handoff, physical SOS creation, durable queuing, and direct LoRa transmission. Stationary buoys retain fixed environmental sensing and optional relay behavior. The tall shore gateway bridges the low-bandwidth safety network to the backend without changing the original source identity or event time. Backend services perform cross-node correlation and model execution, while the operations console remains the human decision point for acknowledgement, dispatch, search allocation, cancellation, and closure.</w:t>
       </w:r>
     </w:p>
     <w:p>
@@ -1994,13 +1916,7 @@
         <w:ind w:firstLine="432"/>
       </w:pPr>
       <w:r>
-        <w:rPr>
-          <w:rFonts w:ascii="Arial" w:hAnsi="Arial"/>
-          <w:b w:val="0"/>
-          <w:color w:val="161616"/>
-          <w:sz w:val="20"/>
-        </w:rPr>
-        <w:t>Sudden localized convective squalls can form and strike at a scale regional forecasts do not resolve. AqOne treats each node as a moving pressure station. Observations are time-aligned, checked for sensor drift and implausible jumps, and transformed into pressure tendency, spatial gradient, propagation direction, node density, and freshness features. A graph model is attractive because the sensors are irregular and moving; a convolutional-recurrent alternative may be used after interpolation onto water cells if it proves simpler and equally accurate.</w:t>
+        <w:t>Sudden localized convective squalls can form and strike at a scale regional forecasts do not resolve. AqOne treats each stationary sensor buoy as a fixed pressure station. Observations are time-aligned, checked for sensor drift and implausible jumps, and transformed into pressure tendency, spatial gradient, propagation direction, node density, and freshness features. A graph model is attractive because the fixed stations are spatially irregular; a convolutional-recurrent alternative may be used after interpolation onto water cells if it proves simpler and equally accurate.</w:t>
       </w:r>
     </w:p>
     <w:p>
@@ -2099,13 +2015,7 @@
         <w:ind w:firstLine="432"/>
       </w:pPr>
       <w:r>
-        <w:rPr>
-          <w:rFonts w:ascii="Arial" w:hAnsi="Arial"/>
-          <w:b w:val="0"/>
-          <w:color w:val="161616"/>
-          <w:sz w:val="20"/>
-        </w:rPr>
-        <w:t>The mesh can improve this baseline only if its GPS observations are interpreted carefully. A powered or actively fishing vessel is not a passive drifter. The local-current pipeline must filter by operating state, compare against environmental forcing, quantify uncertainty, and demonstrate on held-out trajectories that the residual correction outperforms the raw model before production use. As search assets report sectors and findings, Bayesian updates reduce probability in adequately searched areas and reallocate effort toward the highest remaining probability mass. Survivability weighting supports multi-incident prioritization without hiding the unweighted spatial probability.</w:t>
+        <w:t>The network can improve this baseline only if its observations are interpreted carefully. A powered or actively fishing boat pod is not a passive drifter, while a stationary sensor buoy provides a fixed environmental reference. The local-current pipeline must separate these roles, compare against environmental forcing, quantify uncertainty, and demonstrate on held-out trajectories that any residual correction outperforms the raw model before production use. As search assets report sectors and findings, Bayesian updates reduce probability in adequately searched areas and reallocate effort toward the highest remaining probability mass. Survivability weighting supports multi-incident prioritization without hiding the unweighted spatial probability.</w:t>
       </w:r>
     </w:p>
     <w:p>
@@ -2129,13 +2039,7 @@
         <w:ind w:firstLine="432"/>
       </w:pPr>
       <w:r>
-        <w:rPr>
-          <w:rFonts w:ascii="Arial" w:hAnsi="Arial"/>
-          <w:b w:val="0"/>
-          <w:color w:val="161616"/>
-          <w:sz w:val="20"/>
-        </w:rPr>
-        <w:t>Hardware is essential rather than optional. The boat-mounted node creates the communication network and the proprietary observation stream used by all three model stages. GNSS provides location, course, speed, drift evidence, and event time. The IMU enables local motion classification and object-state inference. The barometer supplies the distributed pressure field for nowcasting. Heartbeats and radio-route metadata make silence and neighbor corroboration observable. Health sensors prevent stale or faulty measurements from being treated as trustworthy evidence.</w:t>
+        <w:t>Hardware is essential, but not every sensor belongs on every node. The boat pod creates the primary communication path, physical SOS event, and optional vessel telemetry. GNSS provides location, course, speed, drift evidence, and event time where fitted. Stationary buoy barometers supply the fixed pressure field for nowcasting; optional IMU/current observations remain location-specific evidence. Heartbeats and radio-route metadata make silence and neighbor corroboration observable. Health flags prevent stale or faulty measurements from being treated as trustworthy evidence.</w:t>
       </w:r>
     </w:p>
     <w:p>
@@ -3122,13 +3026,7 @@
         <w:ind w:firstLine="432"/>
       </w:pPr>
       <w:r>
-        <w:rPr>
-          <w:rFonts w:ascii="Arial" w:hAnsi="Arial"/>
-          <w:b w:val="0"/>
-          <w:color w:val="161616"/>
-          <w:sz w:val="20"/>
-        </w:rPr>
-        <w:t>The pipeline begins at the node, where timestamps, calibration, bounded schemas, and quality flags are attached as close to the sensor as possible. Routine data is summarized to conserve airtime, while suspected events retain the relevant pre-trigger and post-trigger window. Packets receive a unique identity, source/sequence information, priority, expiry, and integrity protection before entering a durable local queue.</w:t>
+        <w:t>The pipeline begins at a boat pod or stationary field node, where timestamps, calibration, bounded schemas, and quality flags are attached as close to the sensor as possible. Routine data is summarized to conserve airtime, while critical events retain the relevant evidence. Packets receive a unique identity, source/sequence information, priority, expiry, and integrity protection before entering a durable local queue.</w:t>
       </w:r>
     </w:p>
     <w:p>
@@ -3302,13 +3200,7 @@
         <w:ind w:firstLine="432"/>
       </w:pPr>
       <w:r>
-        <w:rPr>
-          <w:rFonts w:ascii="Arial" w:hAnsi="Arial"/>
-          <w:b w:val="0"/>
-          <w:color w:val="161616"/>
-          <w:sz w:val="20"/>
-        </w:rPr>
-        <w:t>AqOne depends on fleet density. A node with no reachable neighbor cannot deliver immediately, although it continues to store and retry critical events. LoRa performance depends on antenna installation, sea state, vessel spacing, interference, regulatory limits, and gateway placement; realistic offshore range and duty cycle remain field-test questions. A broken power connection, damaged antenna, flooded enclosure, sensor drift, or outdated firmware can create a coverage and detection gap despite software health checks.</w:t>
+        <w:t>AqOne depends on pod availability, gateway placement, and measured radio geometry. A pod with no direct or relayed path cannot deliver immediately, although it continues to store and retry critical events. LoRa performance depends on antenna installation, sea state, pod position, optional relay placement, interference, regulatory limits, and the tall gateway's height; realistic offshore range and duty cycle remain field-test questions. A broken power connection, damaged antenna, flooded enclosure, sensor drift, or outdated firmware can create a coverage and detection gap despite software health checks.</w:t>
       </w:r>
     </w:p>
     <w:p>

</xml_diff>